<commit_message>
Add irregular verbs flashcard learning and quiz module
</commit_message>
<xml_diff>
--- a/英语学习App 使用手册.docx
+++ b/英语学习App 使用手册.docx
@@ -10,51 +10,111 @@
           <w:bCs/>
         </w:rPr>
       </w:pPr>
-      <w:r>
-        <w:rPr>
+      <w:proofErr w:type="spellStart"/>
+      <w:r>
+        <w:rPr>
+          <w:rFonts w:hint="eastAsia"/>
           <w:b/>
           <w:bCs/>
         </w:rPr>
-        <w:t>英语学习App 使用手册</w:t>
-      </w:r>
-    </w:p>
-    <w:p/>
-    <w:p>
-      <w:r>
-        <w:t>这是一款专为</w:t>
-      </w:r>
-      <w:r>
-        <w:rPr>
-          <w:rFonts w:hint="eastAsia"/>
-        </w:rPr>
-        <w:t>小学/</w:t>
-      </w:r>
-      <w:r>
-        <w:t>初中学生设计的英语提分训练系统。通过每日练习，帮助你提高词汇量、语法能力和阅读理解。</w:t>
-      </w:r>
-    </w:p>
-    <w:p>
-      <w:pPr>
-        <w:rPr>
-          <w:rFonts w:hint="eastAsia"/>
-        </w:rPr>
-      </w:pPr>
-    </w:p>
-    <w:p>
-      <w:r>
-        <w:t>## 一、登录</w:t>
-      </w:r>
-    </w:p>
-    <w:p/>
-    <w:p>
-      <w:r>
-        <w:t>1. 打开网址：</w:t>
-      </w:r>
+        <w:t>Worldwise</w:t>
+      </w:r>
+      <w:proofErr w:type="spellEnd"/>
       <w:r>
         <w:rPr>
           <w:b/>
           <w:bCs/>
         </w:rPr>
+        <w:t>英语学习App 使用手册</w:t>
+      </w:r>
+    </w:p>
+    <w:p/>
+    <w:p>
+      <w:r>
+        <w:rPr>
+          <w:rFonts w:hint="eastAsia"/>
+        </w:rPr>
+        <w:t>本App用于每天/每周的英语学习，包括单词闪卡、听写、语法练习、句子结构拆分等。后续会不断加入新的功能模块。</w:t>
+      </w:r>
+    </w:p>
+    <w:p>
+      <w:pPr>
+        <w:rPr>
+          <w:rFonts w:hint="eastAsia"/>
+          <w:b/>
+          <w:bCs/>
+        </w:rPr>
+      </w:pPr>
+      <w:r>
+        <w:rPr>
+          <w:rFonts w:hint="eastAsia"/>
+          <w:b/>
+          <w:bCs/>
+        </w:rPr>
+        <w:t>如果已经在百词斩上每天背单词，可以不用</w:t>
+      </w:r>
+      <w:r>
+        <w:rPr>
+          <w:rFonts w:hint="eastAsia"/>
+          <w:b/>
+          <w:bCs/>
+        </w:rPr>
+        <w:t>做</w:t>
+      </w:r>
+      <w:r>
+        <w:rPr>
+          <w:rFonts w:hint="eastAsia"/>
+          <w:b/>
+          <w:bCs/>
+        </w:rPr>
+        <w:t>这里的单词闪卡和听写，</w:t>
+      </w:r>
+      <w:r>
+        <w:rPr>
+          <w:rFonts w:hint="eastAsia"/>
+          <w:b/>
+          <w:bCs/>
+        </w:rPr>
+        <w:t>只</w:t>
+      </w:r>
+      <w:r>
+        <w:rPr>
+          <w:rFonts w:hint="eastAsia"/>
+          <w:b/>
+          <w:bCs/>
+        </w:rPr>
+        <w:t>做语法练习和句子结构拆分。</w:t>
+      </w:r>
+    </w:p>
+    <w:p>
+      <w:pPr>
+        <w:rPr>
+          <w:rFonts w:hint="eastAsia"/>
+        </w:rPr>
+      </w:pPr>
+    </w:p>
+    <w:p>
+      <w:r>
+        <w:t>## 一、</w:t>
+      </w:r>
+      <w:r>
+        <w:rPr>
+          <w:b/>
+          <w:bCs/>
+        </w:rPr>
+        <w:t>登录</w:t>
+      </w:r>
+    </w:p>
+    <w:p/>
+    <w:p>
+      <w:r>
+        <w:t>1. 打开网址：</w:t>
+      </w:r>
+      <w:r>
+        <w:rPr>
+          <w:b/>
+          <w:bCs/>
+        </w:rPr>
         <w:t>https://carriezhu0113-bit.github.io/Worldwise/</w:t>
       </w:r>
     </w:p>
@@ -71,7 +131,17 @@
     <w:p/>
     <w:p>
       <w:r>
-        <w:t>## 二、首页（</w:t>
+        <w:t>## 二、</w:t>
+      </w:r>
+      <w:r>
+        <w:rPr>
+          <w:b/>
+          <w:bCs/>
+        </w:rPr>
+        <w:t>首页</w:t>
+      </w:r>
+      <w:r>
+        <w:t>（</w:t>
       </w:r>
       <w:r>
         <w:rPr>
@@ -83,267 +153,449 @@
         <w:t>）</w:t>
       </w:r>
     </w:p>
+    <w:p>
+      <w:r>
+        <w:rPr>
+          <w:noProof/>
+          <w:lang w:val="zh-CN"/>
+        </w:rPr>
+        <w:drawing>
+          <wp:inline distT="0" distB="0" distL="0" distR="0" wp14:anchorId="40658FB6" wp14:editId="415C1B27">
+            <wp:extent cx="5274310" cy="665480"/>
+            <wp:effectExtent l="0" t="0" r="0" b="0"/>
+            <wp:docPr id="425833134" name="图片 9" descr="图形用户界面&#10;&#10;描述已自动生成"/>
+            <wp:cNvGraphicFramePr>
+              <a:graphicFrameLocks xmlns:a="http://schemas.openxmlformats.org/drawingml/2006/main" noChangeAspect="1"/>
+            </wp:cNvGraphicFramePr>
+            <a:graphic xmlns:a="http://schemas.openxmlformats.org/drawingml/2006/main">
+              <a:graphicData uri="http://schemas.openxmlformats.org/drawingml/2006/picture">
+                <pic:pic xmlns:pic="http://schemas.openxmlformats.org/drawingml/2006/picture">
+                  <pic:nvPicPr>
+                    <pic:cNvPr id="425833134" name="图片 9" descr="图形用户界面&#10;&#10;描述已自动生成"/>
+                    <pic:cNvPicPr/>
+                  </pic:nvPicPr>
+                  <pic:blipFill>
+                    <a:blip r:embed="rId5">
+                      <a:extLst>
+                        <a:ext uri="{28A0092B-C50C-407E-A947-70E740481C1C}">
+                          <a14:useLocalDpi xmlns:a14="http://schemas.microsoft.com/office/drawing/2010/main" val="0"/>
+                        </a:ext>
+                      </a:extLst>
+                    </a:blip>
+                    <a:stretch>
+                      <a:fillRect/>
+                    </a:stretch>
+                  </pic:blipFill>
+                  <pic:spPr>
+                    <a:xfrm>
+                      <a:off x="0" y="0"/>
+                      <a:ext cx="5274310" cy="665480"/>
+                    </a:xfrm>
+                    <a:prstGeom prst="rect">
+                      <a:avLst/>
+                    </a:prstGeom>
+                  </pic:spPr>
+                </pic:pic>
+              </a:graphicData>
+            </a:graphic>
+          </wp:inline>
+        </w:drawing>
+      </w:r>
+    </w:p>
+    <w:p>
+      <w:r>
+        <w:t>登录后首先看到的是首页，这里显示你的学习数据：</w:t>
+      </w:r>
+    </w:p>
     <w:p/>
     <w:p>
       <w:r>
-        <w:t>登录后首先看到的是首页，这里显示你的学习数据：</w:t>
+        <w:t>- **已学单词**：累计学习过的单词数量</w:t>
+      </w:r>
+    </w:p>
+    <w:p>
+      <w:r>
+        <w:t>- **完成测试**：完成的练习次数</w:t>
+      </w:r>
+    </w:p>
+    <w:p>
+      <w:r>
+        <w:t>- **正确率**：所有测试的平均正确率</w:t>
+      </w:r>
+    </w:p>
+    <w:p>
+      <w:r>
+        <w:t>- **待复习错题**：需要复习的错题数量</w:t>
       </w:r>
     </w:p>
     <w:p/>
     <w:p>
       <w:r>
-        <w:t>- **已学单词**：累计学习过的单词数量</w:t>
-      </w:r>
-    </w:p>
-    <w:p>
-      <w:r>
-        <w:t>- **完成测试**：完成的练习次数</w:t>
-      </w:r>
-    </w:p>
-    <w:p>
-      <w:r>
-        <w:t>- **正确率**：所有测试的平均正确率</w:t>
-      </w:r>
-    </w:p>
-    <w:p>
-      <w:r>
-        <w:t>- **待复习错题**：需要复习的错题数量</w:t>
+        <w:t>**今日任务** 会显示你今天需要完成的内容进度，包括：</w:t>
+      </w:r>
+    </w:p>
+    <w:p>
+      <w:r>
+        <w:t>- 需要学习的单词数量</w:t>
+      </w:r>
+    </w:p>
+    <w:p>
+      <w:r>
+        <w:t>- 已完成的测试次数</w:t>
+      </w:r>
+    </w:p>
+    <w:p>
+      <w:pPr>
+        <w:rPr>
+          <w:rFonts w:hint="eastAsia"/>
+        </w:rPr>
+      </w:pPr>
+      <w:r>
+        <w:t>- 待复习的错题数量</w:t>
+      </w:r>
+    </w:p>
+    <w:p>
+      <w:pPr>
+        <w:rPr>
+          <w:rFonts w:hint="eastAsia"/>
+        </w:rPr>
+      </w:pPr>
+      <w:r>
+        <w:t>---</w:t>
+      </w:r>
+    </w:p>
+    <w:p>
+      <w:r>
+        <w:t>## 三、</w:t>
+      </w:r>
+      <w:r>
+        <w:rPr>
+          <w:b/>
+          <w:bCs/>
+        </w:rPr>
+        <w:t>单词闪卡</w:t>
+      </w:r>
+      <w:r>
+        <w:t>（</w:t>
+      </w:r>
+      <w:r>
+        <w:rPr>
+          <w:rFonts w:ascii="Apple Color Emoji" w:hAnsi="Apple Color Emoji" w:cs="Apple Color Emoji"/>
+        </w:rPr>
+        <w:t>🃏</w:t>
+      </w:r>
+      <w:r>
+        <w:t>）</w:t>
       </w:r>
     </w:p>
     <w:p/>
     <w:p>
       <w:r>
-        <w:t>**今日任务** 会显示你今天需要完成的内容进度，包括：</w:t>
-      </w:r>
-    </w:p>
-    <w:p>
-      <w:r>
-        <w:t>- 需要学习的单词数量</w:t>
-      </w:r>
-    </w:p>
-    <w:p>
-      <w:r>
-        <w:t>- 已完成的测试次数</w:t>
-      </w:r>
-    </w:p>
-    <w:p>
-      <w:r>
-        <w:t>- 待复习的错题数量</w:t>
+        <w:t>**功能**：听读音选中文，帮助记忆单词</w:t>
       </w:r>
     </w:p>
     <w:p/>
     <w:p>
       <w:r>
+        <w:t>**使用方法**：</w:t>
+      </w:r>
+    </w:p>
+    <w:p>
+      <w:r>
+        <w:t>1. 点击底部导航栏的 **" 单词闪卡"**</w:t>
+      </w:r>
+    </w:p>
+    <w:p>
+      <w:r>
+        <w:t>2. 系统会播放单词的英文发音</w:t>
+      </w:r>
+    </w:p>
+    <w:p>
+      <w:r>
+        <w:t>3. 从 4 个中文选项中选择正确的意思</w:t>
+      </w:r>
+    </w:p>
+    <w:p>
+      <w:r>
+        <w:t xml:space="preserve">4. 选对显示 </w:t>
+      </w:r>
+      <w:r>
+        <w:rPr>
+          <w:rFonts w:ascii="Apple Color Emoji" w:hAnsi="Apple Color Emoji" w:cs="Apple Color Emoji"/>
+        </w:rPr>
+        <w:t>✅</w:t>
+      </w:r>
+      <w:r>
+        <w:t xml:space="preserve">，选错显示 </w:t>
+      </w:r>
+      <w:r>
+        <w:rPr>
+          <w:rFonts w:ascii="Apple Color Emoji" w:hAnsi="Apple Color Emoji" w:cs="Apple Color Emoji"/>
+        </w:rPr>
+        <w:t>❌</w:t>
+      </w:r>
+      <w:r>
+        <w:t xml:space="preserve"> 并给出正确答案</w:t>
+      </w:r>
+    </w:p>
+    <w:p>
+      <w:r>
+        <w:t>5. 点击 **"下一个 →"** 继续</w:t>
+      </w:r>
+    </w:p>
+    <w:p/>
+    <w:p>
+      <w:r>
+        <w:t>**提示**：</w:t>
+      </w:r>
+    </w:p>
+    <w:p>
+      <w:r>
+        <w:t>- 每天推送 40 个新单词</w:t>
+      </w:r>
+    </w:p>
+    <w:p>
+      <w:r>
+        <w:t>- 听不清可以点击发音按钮重新播放</w:t>
+      </w:r>
+    </w:p>
+    <w:p>
+      <w:pPr>
+        <w:rPr>
+          <w:rFonts w:hint="eastAsia"/>
+        </w:rPr>
+      </w:pPr>
+      <w:r>
+        <w:lastRenderedPageBreak/>
+        <w:t>- 选错的单词会自动加入错题本</w:t>
+      </w:r>
+    </w:p>
+    <w:p>
+      <w:r>
         <w:t>---</w:t>
       </w:r>
     </w:p>
     <w:p/>
     <w:p>
-      <w:r>
-        <w:t>## 三、单词闪卡（</w:t>
+      <w:pPr>
+        <w:rPr>
+          <w:rFonts w:hint="eastAsia"/>
+        </w:rPr>
+      </w:pPr>
+      <w:r>
+        <w:t>## 四、</w:t>
+      </w:r>
+      <w:r>
+        <w:rPr>
+          <w:b/>
+          <w:bCs/>
+        </w:rPr>
+        <w:t>听写</w:t>
+      </w:r>
+      <w:r>
+        <w:t>（</w:t>
       </w:r>
       <w:r>
         <w:rPr>
           <w:rFonts w:ascii="Apple Color Emoji" w:hAnsi="Apple Color Emoji" w:cs="Apple Color Emoji"/>
         </w:rPr>
-        <w:t>🃏</w:t>
+        <w:t>✏️</w:t>
       </w:r>
       <w:r>
         <w:t>）</w:t>
       </w:r>
     </w:p>
-    <w:p/>
-    <w:p>
-      <w:r>
-        <w:t>**功能**：听读音选中文，帮助记忆单词</w:t>
-      </w:r>
-    </w:p>
-    <w:p/>
+    <w:p>
+      <w:pPr>
+        <w:rPr>
+          <w:rFonts w:hint="eastAsia"/>
+        </w:rPr>
+      </w:pPr>
+      <w:r>
+        <w:t>**功能**：听音拼写，训练拼写能力</w:t>
+      </w:r>
+    </w:p>
     <w:p>
       <w:r>
         <w:t>**使用方法**：</w:t>
       </w:r>
     </w:p>
     <w:p>
-      <w:r>
-        <w:t>1. 点击底部导航栏的 **" 单词闪卡"**</w:t>
-      </w:r>
-    </w:p>
-    <w:p>
-      <w:r>
-        <w:t>2. 系统会播放单词的英文发音</w:t>
-      </w:r>
-    </w:p>
-    <w:p>
-      <w:r>
-        <w:t>3. 从 4 个中文选项中选择正确的意思</w:t>
-      </w:r>
-    </w:p>
-    <w:p>
-      <w:r>
-        <w:t xml:space="preserve">4. 选对显示 </w:t>
+      <w:pPr>
+        <w:pStyle w:val="a9"/>
+        <w:numPr>
+          <w:ilvl w:val="0"/>
+          <w:numId w:val="2"/>
+        </w:numPr>
+      </w:pPr>
+      <w:r>
+        <w:t>点击 **"</w:t>
       </w:r>
       <w:r>
         <w:rPr>
           <w:rFonts w:ascii="Apple Color Emoji" w:hAnsi="Apple Color Emoji" w:cs="Apple Color Emoji"/>
         </w:rPr>
-        <w:t>✅</w:t>
-      </w:r>
-      <w:r>
-        <w:t xml:space="preserve">，选错显示 </w:t>
+        <w:t>🔊</w:t>
+      </w:r>
+      <w:r>
+        <w:t xml:space="preserve"> 播放单词"** 按钮，听单词发音</w:t>
+      </w:r>
+    </w:p>
+    <w:p>
+      <w:pPr>
+        <w:pStyle w:val="a9"/>
+        <w:ind w:left="360"/>
+        <w:rPr>
+          <w:rFonts w:hint="eastAsia"/>
+        </w:rPr>
+      </w:pPr>
+      <w:r>
+        <w:rPr>
+          <w:rFonts w:hint="eastAsia"/>
+          <w:noProof/>
+        </w:rPr>
+        <w:drawing>
+          <wp:inline distT="0" distB="0" distL="0" distR="0" wp14:anchorId="60AB56BF" wp14:editId="4088284A">
+            <wp:extent cx="3421380" cy="1565695"/>
+            <wp:effectExtent l="0" t="0" r="0" b="0"/>
+            <wp:docPr id="890362900" name="图片 8" descr="图形用户界面, 应用程序, Teams&#10;&#10;描述已自动生成"/>
+            <wp:cNvGraphicFramePr>
+              <a:graphicFrameLocks xmlns:a="http://schemas.openxmlformats.org/drawingml/2006/main" noChangeAspect="1"/>
+            </wp:cNvGraphicFramePr>
+            <a:graphic xmlns:a="http://schemas.openxmlformats.org/drawingml/2006/main">
+              <a:graphicData uri="http://schemas.openxmlformats.org/drawingml/2006/picture">
+                <pic:pic xmlns:pic="http://schemas.openxmlformats.org/drawingml/2006/picture">
+                  <pic:nvPicPr>
+                    <pic:cNvPr id="890362900" name="图片 8" descr="图形用户界面, 应用程序, Teams&#10;&#10;描述已自动生成"/>
+                    <pic:cNvPicPr/>
+                  </pic:nvPicPr>
+                  <pic:blipFill>
+                    <a:blip r:embed="rId6" cstate="print">
+                      <a:extLst>
+                        <a:ext uri="{28A0092B-C50C-407E-A947-70E740481C1C}">
+                          <a14:useLocalDpi xmlns:a14="http://schemas.microsoft.com/office/drawing/2010/main" val="0"/>
+                        </a:ext>
+                      </a:extLst>
+                    </a:blip>
+                    <a:stretch>
+                      <a:fillRect/>
+                    </a:stretch>
+                  </pic:blipFill>
+                  <pic:spPr>
+                    <a:xfrm>
+                      <a:off x="0" y="0"/>
+                      <a:ext cx="3440160" cy="1574289"/>
+                    </a:xfrm>
+                    <a:prstGeom prst="rect">
+                      <a:avLst/>
+                    </a:prstGeom>
+                  </pic:spPr>
+                </pic:pic>
+              </a:graphicData>
+            </a:graphic>
+          </wp:inline>
+        </w:drawing>
+      </w:r>
+    </w:p>
+    <w:p>
+      <w:r>
+        <w:t>2. 在输入框中拼写出你听到的单词</w:t>
+      </w:r>
+    </w:p>
+    <w:p>
+      <w:r>
+        <w:t>3. 点击 **"提交"**</w:t>
+      </w:r>
+    </w:p>
+    <w:p>
+      <w:r>
+        <w:t>4. 正确显示绿色，错误显示红色并给出正确答案</w:t>
+      </w:r>
+    </w:p>
+    <w:p>
+      <w:pPr>
+        <w:rPr>
+          <w:rFonts w:hint="eastAsia"/>
+        </w:rPr>
+      </w:pPr>
+      <w:r>
+        <w:t>5. 系统自动进入下一个单词</w:t>
+      </w:r>
+    </w:p>
+    <w:p>
+      <w:r>
+        <w:t>**提示**：</w:t>
+      </w:r>
+    </w:p>
+    <w:p>
+      <w:r>
+        <w:t>- 每天从推送的单词中随机选择 10 个进行听写</w:t>
+      </w:r>
+    </w:p>
+    <w:p>
+      <w:r>
+        <w:t>- 输入时不区分大小写</w:t>
+      </w:r>
+    </w:p>
+    <w:p>
+      <w:pPr>
+        <w:rPr>
+          <w:rFonts w:hint="eastAsia"/>
+        </w:rPr>
+      </w:pPr>
+      <w:r>
+        <w:t>- 拼写错误的单词会加入错题本</w:t>
+      </w:r>
+    </w:p>
+    <w:p>
+      <w:pPr>
+        <w:rPr>
+          <w:rFonts w:hint="eastAsia"/>
+        </w:rPr>
+      </w:pPr>
+      <w:r>
+        <w:t>---</w:t>
+      </w:r>
+    </w:p>
+    <w:p>
+      <w:pPr>
+        <w:rPr>
+          <w:rFonts w:hint="eastAsia"/>
+        </w:rPr>
+      </w:pPr>
+      <w:r>
+        <w:t>## 五、</w:t>
+      </w:r>
+      <w:r>
+        <w:rPr>
+          <w:b/>
+          <w:bCs/>
+        </w:rPr>
+        <w:t>语法练习</w:t>
+      </w:r>
+      <w:r>
+        <w:t>（</w:t>
       </w:r>
       <w:r>
         <w:rPr>
           <w:rFonts w:ascii="Apple Color Emoji" w:hAnsi="Apple Color Emoji" w:cs="Apple Color Emoji"/>
         </w:rPr>
-        <w:t>❌</w:t>
-      </w:r>
-      <w:r>
-        <w:t xml:space="preserve"> 并给出正确答案</w:t>
-      </w:r>
-    </w:p>
-    <w:p>
-      <w:r>
-        <w:t>5. 点击 **"下一个 →"** 继续</w:t>
-      </w:r>
-    </w:p>
-    <w:p/>
-    <w:p>
-      <w:r>
-        <w:t>**提示**：</w:t>
-      </w:r>
-    </w:p>
-    <w:p>
-      <w:r>
-        <w:t>- 每天推送 40 个新单词</w:t>
-      </w:r>
-    </w:p>
-    <w:p>
-      <w:r>
-        <w:t>- 听不清可以点击发音按钮重新播放</w:t>
-      </w:r>
-    </w:p>
-    <w:p>
-      <w:r>
-        <w:t>- 选错的单词会自动加入错题本</w:t>
-      </w:r>
-    </w:p>
-    <w:p/>
-    <w:p>
-      <w:r>
-        <w:t>---</w:t>
-      </w:r>
-    </w:p>
-    <w:p/>
-    <w:p>
-      <w:r>
-        <w:t>## 四、听写（</w:t>
-      </w:r>
-      <w:r>
-        <w:rPr>
-          <w:rFonts w:ascii="Apple Color Emoji" w:hAnsi="Apple Color Emoji" w:cs="Apple Color Emoji"/>
-        </w:rPr>
-        <w:t>✏️</w:t>
+        <w:t>📝</w:t>
       </w:r>
       <w:r>
         <w:t>）</w:t>
       </w:r>
     </w:p>
-    <w:p/>
-    <w:p>
-      <w:r>
-        <w:t>**功能**：听音拼写，训练拼写能力</w:t>
-      </w:r>
-    </w:p>
-    <w:p/>
-    <w:p>
-      <w:r>
-        <w:t>**使用方法**：</w:t>
-      </w:r>
-    </w:p>
-    <w:p>
-      <w:r>
-        <w:t>1. 点击 **"</w:t>
-      </w:r>
-      <w:r>
-        <w:rPr>
-          <w:rFonts w:ascii="Apple Color Emoji" w:hAnsi="Apple Color Emoji" w:cs="Apple Color Emoji"/>
-        </w:rPr>
-        <w:t>🔊</w:t>
-      </w:r>
-      <w:r>
-        <w:t xml:space="preserve"> 播放单词"** 按钮，听单词发音</w:t>
-      </w:r>
-    </w:p>
-    <w:p>
-      <w:r>
-        <w:t>2. 在输入框中拼写出你听到的单词</w:t>
-      </w:r>
-    </w:p>
-    <w:p>
-      <w:r>
-        <w:t>3. 点击 **"提交"**</w:t>
-      </w:r>
-    </w:p>
-    <w:p>
-      <w:r>
-        <w:t>4. 正确显示绿色，错误显示红色并给出正确答案</w:t>
-      </w:r>
-    </w:p>
-    <w:p>
-      <w:r>
-        <w:t>5. 系统自动进入下一个单词</w:t>
-      </w:r>
-    </w:p>
-    <w:p/>
-    <w:p>
-      <w:r>
-        <w:t>**提示**：</w:t>
-      </w:r>
-    </w:p>
-    <w:p>
-      <w:r>
-        <w:t>- 每天从推送的单词中随机选择 10 个进行听写</w:t>
-      </w:r>
-    </w:p>
-    <w:p>
-      <w:r>
-        <w:t>- 输入时不区分大小写</w:t>
-      </w:r>
-    </w:p>
-    <w:p>
-      <w:r>
-        <w:t>- 拼写错误的单词会加入错题本</w:t>
-      </w:r>
-    </w:p>
-    <w:p/>
-    <w:p>
-      <w:r>
-        <w:t>---</w:t>
-      </w:r>
-    </w:p>
-    <w:p/>
-    <w:p>
-      <w:r>
-        <w:t>## 五、语法练习（</w:t>
-      </w:r>
-      <w:r>
-        <w:rPr>
-          <w:rFonts w:ascii="Apple Color Emoji" w:hAnsi="Apple Color Emoji" w:cs="Apple Color Emoji"/>
-        </w:rPr>
-        <w:t>📝</w:t>
-      </w:r>
-      <w:r>
-        <w:t>）</w:t>
-      </w:r>
-    </w:p>
-    <w:p/>
-    <w:p>
+    <w:p>
+      <w:pPr>
+        <w:rPr>
+          <w:rFonts w:hint="eastAsia"/>
+        </w:rPr>
+      </w:pPr>
       <w:r>
         <w:t>**功能**：系统学习语法知识，包含三种题型</w:t>
       </w:r>
     </w:p>
-    <w:p/>
     <w:p>
       <w:r>
         <w:t>### 第一步：语法复习</w:t>
@@ -381,7 +633,7 @@
                     <pic:cNvPicPr/>
                   </pic:nvPicPr>
                   <pic:blipFill>
-                    <a:blip r:embed="rId5" cstate="print">
+                    <a:blip r:embed="rId7" cstate="print">
                       <a:extLst>
                         <a:ext uri="{28A0092B-C50C-407E-A947-70E740481C1C}">
                           <a14:useLocalDpi xmlns:a14="http://schemas.microsoft.com/office/drawing/2010/main" val="0"/>
@@ -433,6 +685,7 @@
           <w:rFonts w:hint="eastAsia"/>
           <w:noProof/>
         </w:rPr>
+        <w:lastRenderedPageBreak/>
         <w:drawing>
           <wp:inline distT="0" distB="0" distL="0" distR="0" wp14:anchorId="4F86AD4C" wp14:editId="3C31B83D">
             <wp:extent cx="3535039" cy="556260"/>
@@ -449,7 +702,7 @@
                     <pic:cNvPicPr/>
                   </pic:nvPicPr>
                   <pic:blipFill>
-                    <a:blip r:embed="rId6" cstate="print">
+                    <a:blip r:embed="rId8" cstate="print">
                       <a:extLst>
                         <a:ext uri="{28A0092B-C50C-407E-A947-70E740481C1C}">
                           <a14:useLocalDpi xmlns:a14="http://schemas.microsoft.com/office/drawing/2010/main" val="0"/>
@@ -512,11 +765,15 @@
       </w:r>
     </w:p>
     <w:p>
+      <w:pPr>
+        <w:rPr>
+          <w:rFonts w:hint="eastAsia"/>
+        </w:rPr>
+      </w:pPr>
       <w:r>
         <w:t>5. 答错的题目自动加入错题本</w:t>
       </w:r>
     </w:p>
-    <w:p/>
     <w:p>
       <w:pPr>
         <w:rPr>
@@ -529,7 +786,17 @@
     </w:p>
     <w:p>
       <w:r>
-        <w:t>## 六、句子分析（</w:t>
+        <w:t>## 六、</w:t>
+      </w:r>
+      <w:r>
+        <w:rPr>
+          <w:b/>
+          <w:bCs/>
+        </w:rPr>
+        <w:t>句子分析</w:t>
+      </w:r>
+      <w:r>
+        <w:t>（</w:t>
       </w:r>
       <w:r>
         <w:rPr>
@@ -608,7 +875,7 @@
                     <pic:cNvPicPr/>
                   </pic:nvPicPr>
                   <pic:blipFill>
-                    <a:blip r:embed="rId7" cstate="print">
+                    <a:blip r:embed="rId9" cstate="print">
                       <a:extLst>
                         <a:ext uri="{28A0092B-C50C-407E-A947-70E740481C1C}">
                           <a14:useLocalDpi xmlns:a14="http://schemas.microsoft.com/office/drawing/2010/main" val="0"/>
@@ -732,7 +999,7 @@
                     <pic:cNvPicPr/>
                   </pic:nvPicPr>
                   <pic:blipFill>
-                    <a:blip r:embed="rId8" cstate="print">
+                    <a:blip r:embed="rId10" cstate="print">
                       <a:extLst>
                         <a:ext uri="{28A0092B-C50C-407E-A947-70E740481C1C}">
                           <a14:useLocalDpi xmlns:a14="http://schemas.microsoft.com/office/drawing/2010/main" val="0"/>
@@ -766,6 +1033,7 @@
     </w:p>
     <w:p>
       <w:r>
+        <w:lastRenderedPageBreak/>
         <w:t>5. 在下方输入框写出这句话的**中文翻译**</w:t>
       </w:r>
     </w:p>
@@ -780,7 +1048,6 @@
           <w:rFonts w:hint="eastAsia"/>
           <w:noProof/>
         </w:rPr>
-        <w:lastRenderedPageBreak/>
         <w:drawing>
           <wp:inline distT="0" distB="0" distL="0" distR="0" wp14:anchorId="29B604EF" wp14:editId="7F554170">
             <wp:extent cx="3964306" cy="2202180"/>
@@ -797,7 +1064,7 @@
                     <pic:cNvPicPr/>
                   </pic:nvPicPr>
                   <pic:blipFill>
-                    <a:blip r:embed="rId9" cstate="print">
+                    <a:blip r:embed="rId11" cstate="print">
                       <a:extLst>
                         <a:ext uri="{28A0092B-C50C-407E-A947-70E740481C1C}">
                           <a14:useLocalDpi xmlns:a14="http://schemas.microsoft.com/office/drawing/2010/main" val="0"/>
@@ -861,7 +1128,7 @@
                     <pic:cNvPicPr/>
                   </pic:nvPicPr>
                   <pic:blipFill>
-                    <a:blip r:embed="rId10" cstate="print">
+                    <a:blip r:embed="rId12" cstate="print">
                       <a:extLst>
                         <a:ext uri="{28A0092B-C50C-407E-A947-70E740481C1C}">
                           <a14:useLocalDpi xmlns:a14="http://schemas.microsoft.com/office/drawing/2010/main" val="0"/>
@@ -910,9 +1177,9 @@
           <w:noProof/>
         </w:rPr>
         <w:drawing>
-          <wp:inline distT="0" distB="0" distL="0" distR="0" wp14:anchorId="4717873B" wp14:editId="07B02142">
-            <wp:extent cx="5274310" cy="2116455"/>
-            <wp:effectExtent l="0" t="0" r="0" b="4445"/>
+          <wp:inline distT="0" distB="0" distL="0" distR="0" wp14:anchorId="4717873B" wp14:editId="3C329096">
+            <wp:extent cx="4084320" cy="1638940"/>
+            <wp:effectExtent l="0" t="0" r="5080" b="0"/>
             <wp:docPr id="1235945938" name="图片 7" descr="图形用户界面, 应用程序&#10;&#10;描述已自动生成"/>
             <wp:cNvGraphicFramePr>
               <a:graphicFrameLocks xmlns:a="http://schemas.openxmlformats.org/drawingml/2006/main" noChangeAspect="1"/>
@@ -925,7 +1192,7 @@
                     <pic:cNvPicPr/>
                   </pic:nvPicPr>
                   <pic:blipFill>
-                    <a:blip r:embed="rId11" cstate="print">
+                    <a:blip r:embed="rId13" cstate="print">
                       <a:extLst>
                         <a:ext uri="{28A0092B-C50C-407E-A947-70E740481C1C}">
                           <a14:useLocalDpi xmlns:a14="http://schemas.microsoft.com/office/drawing/2010/main" val="0"/>
@@ -939,7 +1206,7 @@
                   <pic:spPr>
                     <a:xfrm>
                       <a:off x="0" y="0"/>
-                      <a:ext cx="5274310" cy="2116455"/>
+                      <a:ext cx="4111668" cy="1649914"/>
                     </a:xfrm>
                     <a:prstGeom prst="rect">
                       <a:avLst/>
@@ -954,12 +1221,12 @@
     </w:p>
     <w:p>
       <w:r>
+        <w:t>**使用方法**：</w:t>
+      </w:r>
+    </w:p>
+    <w:p>
+      <w:r>
         <w:lastRenderedPageBreak/>
-        <w:t>**使用方法**：</w:t>
-      </w:r>
-    </w:p>
-    <w:p>
-      <w:r>
         <w:t>1. 点击 **" 错题"** 进入</w:t>
       </w:r>
     </w:p>
@@ -1033,59 +1300,27 @@
       </w:r>
     </w:p>
     <w:p>
+      <w:pPr>
+        <w:rPr>
+          <w:rFonts w:hint="eastAsia"/>
+        </w:rPr>
+      </w:pPr>
       <w:r>
         <w:t>- 第 5 次复习后：30 天后移除</w:t>
       </w:r>
     </w:p>
-    <w:p/>
     <w:p>
       <w:r>
         <w:t>---</w:t>
       </w:r>
     </w:p>
-    <w:p/>
-    <w:p>
-      <w:r>
-        <w:t>## 八、每日学习建议</w:t>
-      </w:r>
-    </w:p>
-    <w:p/>
-    <w:p>
-      <w:r>
-        <w:t>**推荐学习顺序**：</w:t>
-      </w:r>
-    </w:p>
-    <w:p>
-      <w:r>
-        <w:t>1. 先看首页，了解今日任务</w:t>
-      </w:r>
-    </w:p>
-    <w:p>
-      <w:r>
-        <w:t>2. 学习新单词（单词闪卡）</w:t>
-      </w:r>
-    </w:p>
-    <w:p>
-      <w:r>
-        <w:t>3. 听写练习</w:t>
-      </w:r>
-    </w:p>
-    <w:p>
-      <w:r>
-        <w:t>4. 语法练习</w:t>
-      </w:r>
-    </w:p>
-    <w:p>
-      <w:r>
-        <w:t>5. 句子分析</w:t>
-      </w:r>
-    </w:p>
-    <w:p>
-      <w:r>
-        <w:t>6. 复习错题本</w:t>
-      </w:r>
-    </w:p>
-    <w:p/>
+    <w:p>
+      <w:pPr>
+        <w:rPr>
+          <w:rFonts w:hint="eastAsia"/>
+        </w:rPr>
+      </w:pPr>
+    </w:p>
     <w:p>
       <w:r>
         <w:t>**每天建议学习时间**：30-45 分钟</w:t>
@@ -1194,8 +1429,100 @@
       </w:pPr>
     </w:lvl>
   </w:abstractNum>
+  <w:abstractNum w:abstractNumId="1" w15:restartNumberingAfterBreak="0">
+    <w:nsid w:val="3BE15B06"/>
+    <w:multiLevelType w:val="hybridMultilevel"/>
+    <w:tmpl w:val="84E83EE8"/>
+    <w:lvl w:ilvl="0" w:tplc="22880094">
+      <w:start w:val="1"/>
+      <w:numFmt w:val="decimal"/>
+      <w:lvlText w:val="%1."/>
+      <w:lvlJc w:val="left"/>
+      <w:pPr>
+        <w:ind w:left="360" w:hanging="360"/>
+      </w:pPr>
+      <w:rPr>
+        <w:rFonts w:hint="default"/>
+      </w:rPr>
+    </w:lvl>
+    <w:lvl w:ilvl="1" w:tplc="04090019" w:tentative="1">
+      <w:start w:val="1"/>
+      <w:numFmt w:val="lowerLetter"/>
+      <w:lvlText w:val="%2)"/>
+      <w:lvlJc w:val="left"/>
+      <w:pPr>
+        <w:ind w:left="880" w:hanging="440"/>
+      </w:pPr>
+    </w:lvl>
+    <w:lvl w:ilvl="2" w:tplc="0409001B" w:tentative="1">
+      <w:start w:val="1"/>
+      <w:numFmt w:val="lowerRoman"/>
+      <w:lvlText w:val="%3."/>
+      <w:lvlJc w:val="right"/>
+      <w:pPr>
+        <w:ind w:left="1320" w:hanging="440"/>
+      </w:pPr>
+    </w:lvl>
+    <w:lvl w:ilvl="3" w:tplc="0409000F" w:tentative="1">
+      <w:start w:val="1"/>
+      <w:numFmt w:val="decimal"/>
+      <w:lvlText w:val="%4."/>
+      <w:lvlJc w:val="left"/>
+      <w:pPr>
+        <w:ind w:left="1760" w:hanging="440"/>
+      </w:pPr>
+    </w:lvl>
+    <w:lvl w:ilvl="4" w:tplc="04090019" w:tentative="1">
+      <w:start w:val="1"/>
+      <w:numFmt w:val="lowerLetter"/>
+      <w:lvlText w:val="%5)"/>
+      <w:lvlJc w:val="left"/>
+      <w:pPr>
+        <w:ind w:left="2200" w:hanging="440"/>
+      </w:pPr>
+    </w:lvl>
+    <w:lvl w:ilvl="5" w:tplc="0409001B" w:tentative="1">
+      <w:start w:val="1"/>
+      <w:numFmt w:val="lowerRoman"/>
+      <w:lvlText w:val="%6."/>
+      <w:lvlJc w:val="right"/>
+      <w:pPr>
+        <w:ind w:left="2640" w:hanging="440"/>
+      </w:pPr>
+    </w:lvl>
+    <w:lvl w:ilvl="6" w:tplc="0409000F" w:tentative="1">
+      <w:start w:val="1"/>
+      <w:numFmt w:val="decimal"/>
+      <w:lvlText w:val="%7."/>
+      <w:lvlJc w:val="left"/>
+      <w:pPr>
+        <w:ind w:left="3080" w:hanging="440"/>
+      </w:pPr>
+    </w:lvl>
+    <w:lvl w:ilvl="7" w:tplc="04090019" w:tentative="1">
+      <w:start w:val="1"/>
+      <w:numFmt w:val="lowerLetter"/>
+      <w:lvlText w:val="%8)"/>
+      <w:lvlJc w:val="left"/>
+      <w:pPr>
+        <w:ind w:left="3520" w:hanging="440"/>
+      </w:pPr>
+    </w:lvl>
+    <w:lvl w:ilvl="8" w:tplc="0409001B" w:tentative="1">
+      <w:start w:val="1"/>
+      <w:numFmt w:val="lowerRoman"/>
+      <w:lvlText w:val="%9."/>
+      <w:lvlJc w:val="right"/>
+      <w:pPr>
+        <w:ind w:left="3960" w:hanging="440"/>
+      </w:pPr>
+    </w:lvl>
+  </w:abstractNum>
   <w:num w:numId="1" w16cid:durableId="961155713">
     <w:abstractNumId w:val="0"/>
+  </w:num>
+  <w:num w:numId="2" w16cid:durableId="887492845">
+    <w:abstractNumId w:val="1"/>
   </w:num>
 </w:numbering>
 </file>

</xml_diff>